<commit_message>
C# FINAL EXAM ADDED
</commit_message>
<xml_diff>
--- a/.netCore/Csharp/Chapter 3/Excercise/Collection And Exception Exercise 3.docx
+++ b/.netCore/Csharp/Chapter 3/Excercise/Collection And Exception Exercise 3.docx
@@ -1,6 +1,6 @@
 
 <file path=word/document.xml><?xml version="1.0" encoding="utf-8"?>
-<w:document xmlns:wpc="http://schemas.microsoft.com/office/word/2010/wordprocessingCanvas" xmlns:cx="http://schemas.microsoft.com/office/drawing/2014/chartex" xmlns:cx1="http://schemas.microsoft.com/office/drawing/2015/9/8/chartex" xmlns:cx2="http://schemas.microsoft.com/office/drawing/2015/10/21/chartex" xmlns:cx3="http://schemas.microsoft.com/office/drawing/2016/5/9/chartex" xmlns:cx4="http://schemas.microsoft.com/office/drawing/2016/5/10/chartex" xmlns:cx5="http://schemas.microsoft.com/office/drawing/2016/5/11/chartex" xmlns:cx6="http://schemas.microsoft.com/office/drawing/2016/5/12/chartex" xmlns:cx7="http://schemas.microsoft.com/office/drawing/2016/5/13/chartex" xmlns:cx8="http://schemas.microsoft.com/office/drawing/2016/5/14/chartex" xmlns:mc="http://schemas.openxmlformats.org/markup-compatibility/2006" xmlns:aink="http://schemas.microsoft.com/office/drawing/2016/ink" xmlns:am3d="http://schemas.microsoft.com/office/drawing/2017/model3d" xmlns:o="urn:schemas-microsoft-com:office:office" xmlns:oel="http://schemas.microsoft.com/office/2019/extlst" xmlns:r="http://schemas.openxmlformats.org/officeDocument/2006/relationships" xmlns:m="http://schemas.openxmlformats.org/officeDocument/2006/math" xmlns:v="urn:schemas-microsoft-com:vml" xmlns:wp14="http://schemas.microsoft.com/office/word/2010/wordprocessingDrawing" xmlns:wp="http://schemas.openxmlformats.org/drawingml/2006/wordprocessingDrawing" xmlns:w10="urn:schemas-microsoft-com:office:word" xmlns:w="http://schemas.openxmlformats.org/wordprocessingml/2006/main" xmlns:w14="http://schemas.microsoft.com/office/word/2010/wordml" xmlns:w15="http://schemas.microsoft.com/office/word/2012/wordml" xmlns:w16cex="http://schemas.microsoft.com/office/word/2018/wordml/cex" xmlns:w16cid="http://schemas.microsoft.com/office/word/2016/wordml/cid" xmlns:w16="http://schemas.microsoft.com/office/word/2018/wordml" xmlns:w16sdtdh="http://schemas.microsoft.com/office/word/2020/wordml/sdtdatahash" xmlns:w16se="http://schemas.microsoft.com/office/word/2015/wordml/symex" xmlns:wpg="http://schemas.microsoft.com/office/word/2010/wordprocessingGroup" xmlns:wpi="http://schemas.microsoft.com/office/word/2010/wordprocessingInk" xmlns:wne="http://schemas.microsoft.com/office/word/2006/wordml" xmlns:wps="http://schemas.microsoft.com/office/word/2010/wordprocessingShape" mc:Ignorable="w14 w15 w16se w16cid w16 w16cex w16sdtdh wp14">
+<w:document xmlns:wpc="http://schemas.microsoft.com/office/word/2010/wordprocessingCanvas" xmlns:cx="http://schemas.microsoft.com/office/drawing/2014/chartex" xmlns:cx1="http://schemas.microsoft.com/office/drawing/2015/9/8/chartex" xmlns:cx2="http://schemas.microsoft.com/office/drawing/2015/10/21/chartex" xmlns:cx3="http://schemas.microsoft.com/office/drawing/2016/5/9/chartex" xmlns:cx4="http://schemas.microsoft.com/office/drawing/2016/5/10/chartex" xmlns:cx5="http://schemas.microsoft.com/office/drawing/2016/5/11/chartex" xmlns:cx6="http://schemas.microsoft.com/office/drawing/2016/5/12/chartex" xmlns:cx7="http://schemas.microsoft.com/office/drawing/2016/5/13/chartex" xmlns:cx8="http://schemas.microsoft.com/office/drawing/2016/5/14/chartex" xmlns:mc="http://schemas.openxmlformats.org/markup-compatibility/2006" xmlns:aink="http://schemas.microsoft.com/office/drawing/2016/ink" xmlns:am3d="http://schemas.microsoft.com/office/drawing/2017/model3d" xmlns:o="urn:schemas-microsoft-com:office:office" xmlns:oel="http://schemas.microsoft.com/office/2019/extlst" xmlns:r="http://schemas.openxmlformats.org/officeDocument/2006/relationships" xmlns:m="http://schemas.openxmlformats.org/officeDocument/2006/math" xmlns:v="urn:schemas-microsoft-com:vml" xmlns:wp14="http://schemas.microsoft.com/office/word/2010/wordprocessingDrawing" xmlns:wp="http://schemas.openxmlformats.org/drawingml/2006/wordprocessingDrawing" xmlns:w10="urn:schemas-microsoft-com:office:word" xmlns:w="http://schemas.openxmlformats.org/wordprocessingml/2006/main" xmlns:w14="http://schemas.microsoft.com/office/word/2010/wordml" xmlns:w15="http://schemas.microsoft.com/office/word/2012/wordml" xmlns:w16cex="http://schemas.microsoft.com/office/word/2018/wordml/cex" xmlns:w16cid="http://schemas.microsoft.com/office/word/2016/wordml/cid" xmlns:w16="http://schemas.microsoft.com/office/word/2018/wordml" xmlns:w16du="http://schemas.microsoft.com/office/word/2023/wordml/word16du" xmlns:w16sdtdh="http://schemas.microsoft.com/office/word/2020/wordml/sdtdatahash" xmlns:w16sdtfl="http://schemas.microsoft.com/office/word/2024/wordml/sdtformatlock" xmlns:w16se="http://schemas.microsoft.com/office/word/2015/wordml/symex" xmlns:wpg="http://schemas.microsoft.com/office/word/2010/wordprocessingGroup" xmlns:wpi="http://schemas.microsoft.com/office/word/2010/wordprocessingInk" xmlns:wne="http://schemas.microsoft.com/office/word/2006/wordml" xmlns:wps="http://schemas.microsoft.com/office/word/2010/wordprocessingShape" mc:Ignorable="w14 w15 w16se w16cid w16 w16cex w16sdtdh w16sdtfl w16du wp14">
   <w:body>
     <w:p>
       <w:pPr>
@@ -114,7 +114,23 @@
           <w:sz w:val="24"/>
           <w:szCs w:val="24"/>
         </w:rPr>
-        <w:t xml:space="preserve"> and Some System Exception and Application Exception and creating Some Custom Exception ..Please follow the guidelines below for an optimal learning experience.</w:t>
+        <w:t xml:space="preserve"> and Some System Exception and Application Exception and creating Some Custom Exception</w:t>
+      </w:r>
+      <w:proofErr w:type="gramStart"/>
+      <w:r>
+        <w:rPr>
+          <w:sz w:val="24"/>
+          <w:szCs w:val="24"/>
+        </w:rPr>
+        <w:t xml:space="preserve"> ..</w:t>
+      </w:r>
+      <w:proofErr w:type="gramEnd"/>
+      <w:r>
+        <w:rPr>
+          <w:sz w:val="24"/>
+          <w:szCs w:val="24"/>
+        </w:rPr>
+        <w:t>Please follow the guidelines below for an optimal learning experience.</w:t>
       </w:r>
     </w:p>
     <w:p>
@@ -220,11 +236,13 @@
       </w:hyperlink>
     </w:p>
     <w:p/>
-    <w:p/>
     <w:p>
       <w:r>
+        <w:rPr>
+          <w:noProof/>
+        </w:rPr>
         <w:drawing>
-          <wp:inline distT="0" distB="0" distL="0" distR="0" wp14:anchorId="572DDDE2" wp14:editId="68F4E4CC">
+          <wp:inline distT="0" distB="0" distL="0" distR="0" wp14:anchorId="3F27C5BE" wp14:editId="520024F4">
             <wp:extent cx="5731510" cy="2522220"/>
             <wp:effectExtent l="0" t="0" r="2540" b="0"/>
             <wp:docPr id="846329120" name="Picture 1"/>
@@ -260,8 +278,12 @@
         </w:drawing>
       </w:r>
     </w:p>
+    <w:p/>
     <w:p>
       <w:r>
+        <w:rPr>
+          <w:noProof/>
+        </w:rPr>
         <w:drawing>
           <wp:inline distT="0" distB="0" distL="0" distR="0" wp14:anchorId="3EEC7108" wp14:editId="7DD28557">
             <wp:extent cx="5731510" cy="3024505"/>
@@ -301,6 +323,9 @@
     </w:p>
     <w:p>
       <w:r>
+        <w:rPr>
+          <w:noProof/>
+        </w:rPr>
         <w:lastRenderedPageBreak/>
         <w:drawing>
           <wp:inline distT="0" distB="0" distL="0" distR="0" wp14:anchorId="3D78CFD4" wp14:editId="7877F292">
@@ -341,6 +366,9 @@
     </w:p>
     <w:p>
       <w:r>
+        <w:rPr>
+          <w:noProof/>
+        </w:rPr>
         <w:drawing>
           <wp:inline distT="0" distB="0" distL="0" distR="0" wp14:anchorId="0387FF72" wp14:editId="22D6F305">
             <wp:extent cx="5731510" cy="3046095"/>
@@ -381,6 +409,9 @@
     <w:p/>
     <w:p>
       <w:r>
+        <w:rPr>
+          <w:noProof/>
+        </w:rPr>
         <w:lastRenderedPageBreak/>
         <w:drawing>
           <wp:inline distT="0" distB="0" distL="0" distR="0" wp14:anchorId="10F1F39D" wp14:editId="474AEDD0">
@@ -419,10 +450,16 @@
         </w:drawing>
       </w:r>
     </w:p>
+    <w:p/>
+    <w:p/>
     <w:p>
       <w:r>
+        <w:rPr>
+          <w:noProof/>
+        </w:rPr>
+        <w:lastRenderedPageBreak/>
         <w:drawing>
-          <wp:inline distT="0" distB="0" distL="0" distR="0" wp14:anchorId="549E02AF" wp14:editId="695BE25A">
+          <wp:inline distT="0" distB="0" distL="0" distR="0" wp14:anchorId="03319464" wp14:editId="3140BD0B">
             <wp:extent cx="5731510" cy="2255520"/>
             <wp:effectExtent l="0" t="0" r="2540" b="0"/>
             <wp:docPr id="19705535" name="Picture 1"/>
@@ -457,10 +494,10 @@
           </wp:inline>
         </w:drawing>
       </w:r>
-    </w:p>
-    <w:p/>
-    <w:p>
-      <w:r>
+      <w:r>
+        <w:rPr>
+          <w:noProof/>
+        </w:rPr>
         <w:drawing>
           <wp:inline distT="0" distB="0" distL="0" distR="0" wp14:anchorId="2F055D6B" wp14:editId="55D593E8">
             <wp:extent cx="5731510" cy="3049905"/>
@@ -500,7 +537,9 @@
     </w:p>
     <w:p>
       <w:r>
-        <w:lastRenderedPageBreak/>
+        <w:rPr>
+          <w:noProof/>
+        </w:rPr>
         <w:drawing>
           <wp:inline distT="0" distB="0" distL="0" distR="0" wp14:anchorId="54FCAF67" wp14:editId="1CFD5C6F">
             <wp:extent cx="5731510" cy="3048000"/>
@@ -547,37 +586,56 @@
           <w:bCs/>
         </w:rPr>
       </w:pPr>
-      <w:proofErr w:type="spellStart"/>
+      <w:r>
+        <w:rPr>
+          <w:b/>
+          <w:bCs/>
+        </w:rPr>
+        <w:t>Note:</w:t>
+      </w:r>
+      <w:r>
+        <w:rPr>
+          <w:b/>
+          <w:bCs/>
+        </w:rPr>
+        <w:t xml:space="preserve"> </w:t>
+      </w:r>
+      <w:r>
+        <w:rPr>
+          <w:b/>
+          <w:bCs/>
+        </w:rPr>
+        <w:t xml:space="preserve">Use dictionary for </w:t>
+      </w:r>
+      <w:r>
+        <w:rPr>
+          <w:b/>
+          <w:bCs/>
+        </w:rPr>
+        <w:t xml:space="preserve">saved </w:t>
+      </w:r>
+      <w:r>
+        <w:rPr>
+          <w:b/>
+          <w:bCs/>
+        </w:rPr>
+        <w:t xml:space="preserve">job </w:t>
+      </w:r>
       <w:proofErr w:type="gramStart"/>
       <w:r>
         <w:rPr>
           <w:b/>
           <w:bCs/>
         </w:rPr>
-        <w:t>Note:Use</w:t>
-      </w:r>
-      <w:proofErr w:type="spellEnd"/>
+        <w:t>list..</w:t>
+      </w:r>
       <w:proofErr w:type="gramEnd"/>
       <w:r>
         <w:rPr>
           <w:b/>
           <w:bCs/>
         </w:rPr>
-        <w:t xml:space="preserve"> dictionary for </w:t>
-      </w:r>
-      <w:r>
-        <w:rPr>
-          <w:b/>
-          <w:bCs/>
-        </w:rPr>
-        <w:t xml:space="preserve">saved </w:t>
-      </w:r>
-      <w:r>
-        <w:rPr>
-          <w:b/>
-          <w:bCs/>
-        </w:rPr>
-        <w:t>job list.. user</w:t>
+        <w:t xml:space="preserve"> user</w:t>
       </w:r>
       <w:r>
         <w:rPr>
@@ -606,7 +664,7 @@
 </file>
 
 <file path=word/styles.xml><?xml version="1.0" encoding="utf-8"?>
-<w:styles xmlns:mc="http://schemas.openxmlformats.org/markup-compatibility/2006" xmlns:r="http://schemas.openxmlformats.org/officeDocument/2006/relationships" xmlns:w="http://schemas.openxmlformats.org/wordprocessingml/2006/main" xmlns:w14="http://schemas.microsoft.com/office/word/2010/wordml" xmlns:w15="http://schemas.microsoft.com/office/word/2012/wordml" xmlns:w16cex="http://schemas.microsoft.com/office/word/2018/wordml/cex" xmlns:w16cid="http://schemas.microsoft.com/office/word/2016/wordml/cid" xmlns:w16="http://schemas.microsoft.com/office/word/2018/wordml" xmlns:w16sdtdh="http://schemas.microsoft.com/office/word/2020/wordml/sdtdatahash" xmlns:w16se="http://schemas.microsoft.com/office/word/2015/wordml/symex" mc:Ignorable="w14 w15 w16se w16cid w16 w16cex w16sdtdh">
+<w:styles xmlns:mc="http://schemas.openxmlformats.org/markup-compatibility/2006" xmlns:r="http://schemas.openxmlformats.org/officeDocument/2006/relationships" xmlns:w="http://schemas.openxmlformats.org/wordprocessingml/2006/main" xmlns:w14="http://schemas.microsoft.com/office/word/2010/wordml" xmlns:w15="http://schemas.microsoft.com/office/word/2012/wordml" xmlns:w16cex="http://schemas.microsoft.com/office/word/2018/wordml/cex" xmlns:w16cid="http://schemas.microsoft.com/office/word/2016/wordml/cid" xmlns:w16="http://schemas.microsoft.com/office/word/2018/wordml" xmlns:w16du="http://schemas.microsoft.com/office/word/2023/wordml/word16du" xmlns:w16sdtdh="http://schemas.microsoft.com/office/word/2020/wordml/sdtdatahash" xmlns:w16sdtfl="http://schemas.microsoft.com/office/word/2024/wordml/sdtformatlock" xmlns:w16se="http://schemas.microsoft.com/office/word/2015/wordml/symex" mc:Ignorable="w14 w15 w16se w16cid w16 w16cex w16sdtdh w16sdtfl w16du">
   <w:docDefaults>
     <w:rPrDefault>
       <w:rPr>

</xml_diff>